<commit_message>
Wire hosted generic DOCX template
</commit_message>
<xml_diff>
--- a/tools/dependency-analysis/ADA/report template.docx
+++ b/tools/dependency-analysis/ADA/report template.docx
@@ -7,220 +7,7 @@
         <w:pStyle w:val="CoverPageTitle"/>
       </w:pPr>
       <w:r>
-        <w:rPr>
-          <w:noProof/>
-        </w:rPr>
-        <mc:AlternateContent>
-          <mc:Choice Requires="wpg">
-            <w:drawing>
-              <wp:anchor distT="0" distB="0" distL="114300" distR="114300" simplePos="0" relativeHeight="251659264" behindDoc="0" locked="0" layoutInCell="1" allowOverlap="1" wp14:anchorId="7BFD8613" wp14:editId="51AC4AEB">
-                <wp:simplePos x="914400" y="988695"/>
-                <wp:positionH relativeFrom="margin">
-                  <wp:align>center</wp:align>
-                </wp:positionH>
-                <wp:positionV relativeFrom="page">
-                  <wp:align>top</wp:align>
-                </wp:positionV>
-                <wp:extent cx="6793993" cy="4078224"/>
-                <wp:effectExtent l="0" t="0" r="6985" b="0"/>
-                <wp:wrapSquare wrapText="bothSides"/>
-                <wp:docPr id="1841149873" name="Group 1841149873"/>
-                <wp:cNvGraphicFramePr>
-                  <a:graphicFrameLocks xmlns:a="http://schemas.openxmlformats.org/drawingml/2006/main" noChangeAspect="1"/>
-                </wp:cNvGraphicFramePr>
-                <a:graphic xmlns:a="http://schemas.openxmlformats.org/drawingml/2006/main">
-                  <a:graphicData uri="http://schemas.microsoft.com/office/word/2010/wordprocessingGroup">
-                    <wpg:wgp>
-                      <wpg:cNvGrpSpPr>
-                        <a:grpSpLocks noChangeAspect="1"/>
-                      </wpg:cNvGrpSpPr>
-                      <wpg:grpSpPr>
-                        <a:xfrm>
-                          <a:off x="0" y="0"/>
-                          <a:ext cx="6793993" cy="4078224"/>
-                          <a:chOff x="-1" y="0"/>
-                          <a:chExt cx="6796141" cy="4080093"/>
-                        </a:xfrm>
-                      </wpg:grpSpPr>
-                      <pic:pic xmlns:pic="http://schemas.openxmlformats.org/drawingml/2006/picture">
-                        <pic:nvPicPr>
-                          <pic:cNvPr id="18093572" name="Picture 10" descr="See the source image"/>
-                          <pic:cNvPicPr preferRelativeResize="0">
-                            <a:picLocks noChangeAspect="1"/>
-                          </pic:cNvPicPr>
-                        </pic:nvPicPr>
-                        <pic:blipFill>
-                          <a:blip r:embed="rId8">
-                            <a:extLst>
-                              <a:ext uri="{28A0092B-C50C-407E-A947-70E740481C1C}">
-                                <a14:useLocalDpi xmlns:a14="http://schemas.microsoft.com/office/drawing/2010/main" val="0"/>
-                              </a:ext>
-                            </a:extLst>
-                          </a:blip>
-                          <a:stretch>
-                            <a:fillRect/>
-                          </a:stretch>
-                        </pic:blipFill>
-                        <pic:spPr bwMode="auto">
-                          <a:xfrm>
-                            <a:off x="-1" y="8894"/>
-                            <a:ext cx="3338615" cy="1966434"/>
-                          </a:xfrm>
-                          <a:prstGeom prst="rect">
-                            <a:avLst/>
-                          </a:prstGeom>
-                          <a:noFill/>
-                        </pic:spPr>
-                      </pic:pic>
-                      <pic:pic xmlns:pic="http://schemas.openxmlformats.org/drawingml/2006/picture">
-                        <pic:nvPicPr>
-                          <pic:cNvPr id="1849772849" name="Picture 11" descr="See the source image"/>
-                          <pic:cNvPicPr/>
-                        </pic:nvPicPr>
-                        <pic:blipFill rotWithShape="1">
-                          <a:blip r:embed="rId9" cstate="print">
-                            <a:extLst>
-                              <a:ext uri="{28A0092B-C50C-407E-A947-70E740481C1C}">
-                                <a14:useLocalDpi xmlns:a14="http://schemas.microsoft.com/office/drawing/2010/main" val="0"/>
-                              </a:ext>
-                            </a:extLst>
-                          </a:blip>
-                          <a:srcRect l="7816" r="8276"/>
-                          <a:stretch/>
-                        </pic:blipFill>
-                        <pic:spPr bwMode="auto">
-                          <a:xfrm>
-                            <a:off x="13648" y="2101755"/>
-                            <a:ext cx="3336290" cy="1964690"/>
-                          </a:xfrm>
-                          <a:prstGeom prst="rect">
-                            <a:avLst/>
-                          </a:prstGeom>
-                          <a:noFill/>
-                          <a:extLst>
-                            <a:ext uri="{53640926-AAD7-44D8-BBD7-CCE9431645EC}">
-                              <a14:shadowObscured xmlns:a14="http://schemas.microsoft.com/office/drawing/2010/main"/>
-                            </a:ext>
-                          </a:extLst>
-                        </pic:spPr>
-                      </pic:pic>
-                      <pic:pic xmlns:pic="http://schemas.openxmlformats.org/drawingml/2006/picture">
-                        <pic:nvPicPr>
-                          <pic:cNvPr id="1431708130" name="Picture 8" descr="See the source image"/>
-                          <pic:cNvPicPr/>
-                        </pic:nvPicPr>
-                        <pic:blipFill>
-                          <a:blip r:embed="rId10" cstate="print">
-                            <a:extLst>
-                              <a:ext uri="{28A0092B-C50C-407E-A947-70E740481C1C}">
-                                <a14:useLocalDpi xmlns:a14="http://schemas.microsoft.com/office/drawing/2010/main" val="0"/>
-                              </a:ext>
-                            </a:extLst>
-                          </a:blip>
-                          <a:stretch>
-                            <a:fillRect/>
-                          </a:stretch>
-                        </pic:blipFill>
-                        <pic:spPr bwMode="auto">
-                          <a:xfrm>
-                            <a:off x="3493827" y="0"/>
-                            <a:ext cx="3276600" cy="1964690"/>
-                          </a:xfrm>
-                          <a:prstGeom prst="rect">
-                            <a:avLst/>
-                          </a:prstGeom>
-                          <a:noFill/>
-                        </pic:spPr>
-                      </pic:pic>
-                      <pic:pic xmlns:pic="http://schemas.openxmlformats.org/drawingml/2006/picture">
-                        <pic:nvPicPr>
-                          <pic:cNvPr id="328241876" name="Picture 6" descr="See the source image"/>
-                          <pic:cNvPicPr/>
-                        </pic:nvPicPr>
-                        <pic:blipFill>
-                          <a:blip r:embed="rId11">
-                            <a:extLst>
-                              <a:ext uri="{28A0092B-C50C-407E-A947-70E740481C1C}">
-                                <a14:useLocalDpi xmlns:a14="http://schemas.microsoft.com/office/drawing/2010/main" val="0"/>
-                              </a:ext>
-                            </a:extLst>
-                          </a:blip>
-                          <a:stretch>
-                            <a:fillRect/>
-                          </a:stretch>
-                        </pic:blipFill>
-                        <pic:spPr bwMode="auto">
-                          <a:xfrm>
-                            <a:off x="3507475" y="2115403"/>
-                            <a:ext cx="3288665" cy="1964690"/>
-                          </a:xfrm>
-                          <a:prstGeom prst="rect">
-                            <a:avLst/>
-                          </a:prstGeom>
-                          <a:noFill/>
-                        </pic:spPr>
-                      </pic:pic>
-                    </wpg:wgp>
-                  </a:graphicData>
-                </a:graphic>
-                <wp14:sizeRelH relativeFrom="margin">
-                  <wp14:pctWidth>0</wp14:pctWidth>
-                </wp14:sizeRelH>
-                <wp14:sizeRelV relativeFrom="margin">
-                  <wp14:pctHeight>0</wp14:pctHeight>
-                </wp14:sizeRelV>
-              </wp:anchor>
-            </w:drawing>
-          </mc:Choice>
-          <mc:Fallback>
-            <w:pict>
-              <v:group w14:anchorId="6B58A5EA" id="Group 1841149873" o:spid="_x0000_s1026" style="position:absolute;margin-left:0;margin-top:0;width:534.95pt;height:321.1pt;z-index:251659264;mso-position-horizontal:center;mso-position-horizontal-relative:margin;mso-position-vertical:top;mso-position-vertical-relative:page;mso-width-relative:margin;mso-height-relative:margin" coordorigin="" coordsize="67961,40800" o:gfxdata="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">
-                <o:lock v:ext="edit" aspectratio="t"/>
-                <v:shapetype id="_x0000_t75" coordsize="21600,21600" o:spt="75" o:preferrelative="t" path="m@4@5l@4@11@9@11@9@5xe" filled="f" stroked="f">
-                  <v:stroke joinstyle="miter"/>
-                  <v:formulas>
-                    <v:f eqn="if lineDrawn pixelLineWidth 0"/>
-                    <v:f eqn="sum @0 1 0"/>
-                    <v:f eqn="sum 0 0 @1"/>
-                    <v:f eqn="prod @2 1 2"/>
-                    <v:f eqn="prod @3 21600 pixelWidth"/>
-                    <v:f eqn="prod @3 21600 pixelHeight"/>
-                    <v:f eqn="sum @0 0 1"/>
-                    <v:f eqn="prod @6 1 2"/>
-                    <v:f eqn="prod @7 21600 pixelWidth"/>
-                    <v:f eqn="sum @8 21600 0"/>
-                    <v:f eqn="prod @7 21600 pixelHeight"/>
-                    <v:f eqn="sum @10 21600 0"/>
-                  </v:formulas>
-                  <v:path o:extrusionok="f" gradientshapeok="t" o:connecttype="rect"/>
-                  <o:lock v:ext="edit" aspectratio="t"/>
-                </v:shapetype>
-                <v:shape id="Picture 10" o:spid="_x0000_s1027" type="#_x0000_t75" alt="See the source image" style="position:absolute;top:88;width:33386;height:19665;visibility:visible;mso-wrap-style:square" o:preferrelative="f" o:gfxdata="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">
-                  <v:imagedata r:id="rId12" o:title="See the source image"/>
-                </v:shape>
-                <v:shape id="Picture 11" o:spid="_x0000_s1028" type="#_x0000_t75" alt="See the source image" style="position:absolute;left:136;top:21017;width:33363;height:19647;visibility:visible;mso-wrap-style:square" o:gfxdata="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">
-                  <v:imagedata r:id="rId13" o:title="See the source image" cropleft="5122f" cropright="5424f"/>
-                </v:shape>
-                <v:shape id="Picture 8" o:spid="_x0000_s1029" type="#_x0000_t75" alt="See the source image" style="position:absolute;left:34938;width:32766;height:19646;visibility:visible;mso-wrap-style:square" o:gfxdata="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">
-                  <v:imagedata r:id="rId14" o:title="See the source image"/>
-                </v:shape>
-                <v:shape id="Picture 6" o:spid="_x0000_s1030" type="#_x0000_t75" alt="See the source image" style="position:absolute;left:35074;top:21154;width:32887;height:19646;visibility:visible;mso-wrap-style:square" o:gfxdata="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">
-                  <v:imagedata r:id="rId15" o:title="See the source image"/>
-                </v:shape>
-                <w10:wrap type="square" anchorx="margin" anchory="page"/>
-              </v:group>
-            </w:pict>
-          </mc:Fallback>
-        </mc:AlternateContent>
-      </w:r>
-      <w:r>
-        <w:t>Asset</w:t>
-      </w:r>
-      <w:r>
-        <w:t xml:space="preserve"> Dependency</w:t>
-      </w:r>
-      <w:r>
-        <w:t xml:space="preserve"> Assessment</w:t>
+        <w:t>[[REPORT_TITLE]]</w:t>
       </w:r>
     </w:p>
     <w:p>
@@ -310,13 +97,7 @@
     <w:p/>
     <w:p>
       <w:r>
-        <w:t>Version</w:t>
-      </w:r>
-      <w:r>
-        <w:t xml:space="preserve">: </w:t>
-      </w:r>
-      <w:r>
-        <w:t>Alpha V3</w:t>
+        <w:t>[[REPORT_SUBTITLE]]</w:t>
       </w:r>
     </w:p>
     <w:p>
@@ -1845,16 +1626,7 @@
       </w:rPr>
     </w:pPr>
     <w:r>
-      <w:rPr>
-        <w:rStyle w:val="1CISAfooterChar"/>
-      </w:rPr>
-      <w:t>CISA | DEFEND TODAY,</w:t>
-    </w:r>
-    <w:r>
-      <w:rPr>
-        <w:rStyle w:val="2CISAfooterChar"/>
-      </w:rPr>
-      <w:t xml:space="preserve"> SECURE TOMORROW</w:t>
+      <w:t>[[REPORT_FOOTER_LEFT]]</w:t>
     </w:r>
   </w:p>
   <w:p>
@@ -1872,13 +1644,7 @@
       </w:rPr>
     </w:pPr>
     <w:r>
-      <w:rPr>
-        <w:rFonts w:ascii="Franklin Gothic Medium" w:hAnsi="Franklin Gothic Medium"/>
-        <w:color w:val="FF0000"/>
-        <w:sz w:val="20"/>
-        <w:szCs w:val="20"/>
-      </w:rPr>
-      <w:t>UNCLASSIFIED//FOR OFFICIAL USE ONLY</w:t>
+      <w:t>[[REPORT_FOOTER_RIGHT]]</w:t>
     </w:r>
   </w:p>
 </w:ftr>
@@ -1916,363 +1682,13 @@
       <w:pStyle w:val="Header"/>
     </w:pPr>
     <w:r>
-      <w:rPr>
-        <w:noProof/>
-      </w:rPr>
-      <mc:AlternateContent>
-        <mc:Choice Requires="wps">
-          <w:drawing>
-            <wp:anchor distT="0" distB="0" distL="114300" distR="114300" simplePos="0" relativeHeight="251657216" behindDoc="0" locked="0" layoutInCell="1" allowOverlap="1" wp14:anchorId="44561ABB" wp14:editId="064D88AD">
-              <wp:simplePos x="0" y="0"/>
-              <wp:positionH relativeFrom="column">
-                <wp:posOffset>2420620</wp:posOffset>
-              </wp:positionH>
-              <wp:positionV relativeFrom="page">
-                <wp:posOffset>28575</wp:posOffset>
-              </wp:positionV>
-              <wp:extent cx="4385310" cy="457200"/>
-              <wp:effectExtent l="0" t="0" r="0" b="0"/>
-              <wp:wrapNone/>
-              <wp:docPr id="20" name="Text Box 20"/>
-              <wp:cNvGraphicFramePr/>
-              <a:graphic xmlns:a="http://schemas.openxmlformats.org/drawingml/2006/main">
-                <a:graphicData uri="http://schemas.microsoft.com/office/word/2010/wordprocessingShape">
-                  <wps:wsp>
-                    <wps:cNvSpPr txBox="1"/>
-                    <wps:spPr>
-                      <a:xfrm>
-                        <a:off x="0" y="0"/>
-                        <a:ext cx="4385310" cy="457200"/>
-                      </a:xfrm>
-                      <a:prstGeom prst="rect">
-                        <a:avLst/>
-                      </a:prstGeom>
-                      <a:noFill/>
-                      <a:ln w="6350">
-                        <a:noFill/>
-                      </a:ln>
-                    </wps:spPr>
-                    <wps:txbx>
-                      <w:txbxContent>
-                        <w:p>
-                          <w:pPr>
-                            <w:pStyle w:val="Title-Factsheet"/>
-                            <w:jc w:val="right"/>
-                            <w:rPr>
-                              <w:sz w:val="22"/>
-                              <w:szCs w:val="22"/>
-                            </w:rPr>
-                          </w:pPr>
-                          <w:r>
-                            <w:rPr>
-                              <w:sz w:val="22"/>
-                              <w:szCs w:val="22"/>
-                            </w:rPr>
-                            <w:t>Asset</w:t>
-                          </w:r>
-                          <w:r>
-                            <w:rPr>
-                              <w:sz w:val="22"/>
-                              <w:szCs w:val="22"/>
-                            </w:rPr>
-                            <w:t xml:space="preserve"> Dependency</w:t>
-                          </w:r>
-                          <w:r>
-                            <w:rPr>
-                              <w:sz w:val="22"/>
-                              <w:szCs w:val="22"/>
-                            </w:rPr>
-                            <w:t xml:space="preserve"> Assessment</w:t>
-                          </w:r>
-                        </w:p>
-                      </w:txbxContent>
-                    </wps:txbx>
-                    <wps:bodyPr rot="0" spcFirstLastPara="0" vertOverflow="overflow" horzOverflow="overflow" vert="horz" wrap="square" lIns="91440" tIns="45720" rIns="91440" bIns="45720" numCol="1" spcCol="0" rtlCol="0" fromWordArt="0" anchor="t" anchorCtr="0" forceAA="0" compatLnSpc="1">
-                      <a:prstTxWarp prst="textNoShape">
-                        <a:avLst/>
-                      </a:prstTxWarp>
-                      <a:noAutofit/>
-                    </wps:bodyPr>
-                  </wps:wsp>
-                </a:graphicData>
-              </a:graphic>
-              <wp14:sizeRelV relativeFrom="margin">
-                <wp14:pctHeight>0</wp14:pctHeight>
-              </wp14:sizeRelV>
-            </wp:anchor>
-          </w:drawing>
-        </mc:Choice>
-        <mc:Fallback>
-          <w:pict>
-            <v:shapetype w14:anchorId="44561ABB" id="_x0000_t202" coordsize="21600,21600" o:spt="202" path="m,l,21600r21600,l21600,xe">
-              <v:stroke joinstyle="miter"/>
-              <v:path gradientshapeok="t" o:connecttype="rect"/>
-            </v:shapetype>
-            <v:shape id="Text Box 20" o:spid="_x0000_s1026" type="#_x0000_t202" style="position:absolute;margin-left:190.6pt;margin-top:2.25pt;width:345.3pt;height:36pt;z-index:251657216;visibility:visible;mso-wrap-style:square;mso-height-percent:0;mso-wrap-distance-left:9pt;mso-wrap-distance-top:0;mso-wrap-distance-right:9pt;mso-wrap-distance-bottom:0;mso-position-horizontal:absolute;mso-position-horizontal-relative:text;mso-position-vertical:absolute;mso-position-vertical-relative:page;mso-height-percent:0;mso-height-relative:margin;v-text-anchor:top" o:gfxdata="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" filled="f" stroked="f" strokeweight=".5pt">
-              <v:textbox>
-                <w:txbxContent>
-                  <w:p>
-                    <w:pPr>
-                      <w:pStyle w:val="Title-Factsheet"/>
-                      <w:jc w:val="right"/>
-                      <w:rPr>
-                        <w:sz w:val="22"/>
-                        <w:szCs w:val="22"/>
-                      </w:rPr>
-                    </w:pPr>
-                    <w:r>
-                      <w:rPr>
-                        <w:sz w:val="22"/>
-                        <w:szCs w:val="22"/>
-                      </w:rPr>
-                      <w:t>Asset</w:t>
-                    </w:r>
-                    <w:r>
-                      <w:rPr>
-                        <w:sz w:val="22"/>
-                        <w:szCs w:val="22"/>
-                      </w:rPr>
-                      <w:t xml:space="preserve"> Dependency</w:t>
-                    </w:r>
-                    <w:r>
-                      <w:rPr>
-                        <w:sz w:val="22"/>
-                        <w:szCs w:val="22"/>
-                      </w:rPr>
-                      <w:t xml:space="preserve"> Assessment</w:t>
-                    </w:r>
-                  </w:p>
-                </w:txbxContent>
-              </v:textbox>
-              <w10:wrap anchory="page"/>
-            </v:shape>
-          </w:pict>
-        </mc:Fallback>
-      </mc:AlternateContent>
+      <w:t>[[REPORT_HEADER_LEFT]]</w:t>
     </w:r>
+  </w:p>
+  <w:p>
     <w:r>
-      <w:rPr>
-        <w:noProof/>
-      </w:rPr>
-      <w:drawing>
-        <wp:anchor distT="0" distB="0" distL="114300" distR="114300" simplePos="0" relativeHeight="251656192" behindDoc="0" locked="0" layoutInCell="1" allowOverlap="1" wp14:anchorId="5390E557" wp14:editId="71D23A31">
-          <wp:simplePos x="0" y="0"/>
-          <wp:positionH relativeFrom="page">
-            <wp:posOffset>-31750</wp:posOffset>
-          </wp:positionH>
-          <wp:positionV relativeFrom="page">
-            <wp:posOffset>0</wp:posOffset>
-          </wp:positionV>
-          <wp:extent cx="7807325" cy="438150"/>
-          <wp:effectExtent l="0" t="0" r="3175" b="0"/>
-          <wp:wrapNone/>
-          <wp:docPr id="1066658377" name="Picture 1066658377"/>
-          <wp:cNvGraphicFramePr>
-            <a:graphicFrameLocks xmlns:a="http://schemas.openxmlformats.org/drawingml/2006/main" noChangeAspect="1"/>
-          </wp:cNvGraphicFramePr>
-          <a:graphic xmlns:a="http://schemas.openxmlformats.org/drawingml/2006/main">
-            <a:graphicData uri="http://schemas.openxmlformats.org/drawingml/2006/picture">
-              <pic:pic xmlns:pic="http://schemas.openxmlformats.org/drawingml/2006/picture">
-                <pic:nvPicPr>
-                  <pic:cNvPr id="27" name="Picture 27"/>
-                  <pic:cNvPicPr/>
-                </pic:nvPicPr>
-                <pic:blipFill rotWithShape="1">
-                  <a:blip r:embed="rId1"/>
-                  <a:srcRect l="-408" b="-307"/>
-                  <a:stretch/>
-                </pic:blipFill>
-                <pic:spPr bwMode="auto">
-                  <a:xfrm>
-                    <a:off x="0" y="0"/>
-                    <a:ext cx="7807732" cy="438173"/>
-                  </a:xfrm>
-                  <a:prstGeom prst="rect">
-                    <a:avLst/>
-                  </a:prstGeom>
-                  <a:ln>
-                    <a:noFill/>
-                  </a:ln>
-                  <a:extLst>
-                    <a:ext uri="{53640926-AAD7-44D8-BBD7-CCE9431645EC}">
-                      <a14:shadowObscured xmlns:a14="http://schemas.microsoft.com/office/drawing/2010/main"/>
-                    </a:ext>
-                  </a:extLst>
-                </pic:spPr>
-              </pic:pic>
-            </a:graphicData>
-          </a:graphic>
-          <wp14:sizeRelH relativeFrom="page">
-            <wp14:pctWidth>0</wp14:pctWidth>
-          </wp14:sizeRelH>
-          <wp14:sizeRelV relativeFrom="page">
-            <wp14:pctHeight>0</wp14:pctHeight>
-          </wp14:sizeRelV>
-        </wp:anchor>
-      </w:drawing>
+      <w:t>[[REPORT_HEADER_RIGHT]]</w:t>
     </w:r>
-    <w:r>
-      <w:rPr>
-        <w:b/>
-        <w:bCs/>
-        <w:noProof/>
-      </w:rPr>
-      <mc:AlternateContent>
-        <mc:Choice Requires="wps">
-          <w:drawing>
-            <wp:anchor distT="0" distB="0" distL="114300" distR="114300" simplePos="0" relativeHeight="251658240" behindDoc="0" locked="1" layoutInCell="1" allowOverlap="1" wp14:anchorId="399CD8D2" wp14:editId="4A11B924">
-              <wp:simplePos x="0" y="0"/>
-              <wp:positionH relativeFrom="margin">
-                <wp:align>center</wp:align>
-              </wp:positionH>
-              <wp:positionV relativeFrom="topMargin">
-                <wp:align>bottom</wp:align>
-              </wp:positionV>
-              <wp:extent cx="2729865" cy="260985"/>
-              <wp:effectExtent l="0" t="0" r="0" b="5715"/>
-              <wp:wrapNone/>
-              <wp:docPr id="19" name="Text Box 19"/>
-              <wp:cNvGraphicFramePr/>
-              <a:graphic xmlns:a="http://schemas.openxmlformats.org/drawingml/2006/main">
-                <a:graphicData uri="http://schemas.microsoft.com/office/word/2010/wordprocessingShape">
-                  <wps:wsp>
-                    <wps:cNvSpPr txBox="1"/>
-                    <wps:spPr>
-                      <a:xfrm>
-                        <a:off x="0" y="0"/>
-                        <a:ext cx="2729865" cy="260985"/>
-                      </a:xfrm>
-                      <a:prstGeom prst="rect">
-                        <a:avLst/>
-                      </a:prstGeom>
-                      <a:noFill/>
-                      <a:ln w="6350">
-                        <a:noFill/>
-                      </a:ln>
-                    </wps:spPr>
-                    <wps:txbx>
-                      <w:txbxContent>
-                        <w:p>
-                          <w:pPr>
-                            <w:jc w:val="center"/>
-                            <w:rPr>
-                              <w:rFonts w:ascii="Franklin Gothic Book" w:hAnsi="Franklin Gothic Book"/>
-                              <w:color w:val="FF0000"/>
-                              <w:sz w:val="15"/>
-                              <w:szCs w:val="15"/>
-                            </w:rPr>
-                          </w:pPr>
-                          <w:r>
-                            <w:rPr>
-                              <w:rFonts w:ascii="Franklin Gothic Medium" w:hAnsi="Franklin Gothic Medium"/>
-                              <w:color w:val="FF0000"/>
-                              <w:sz w:val="20"/>
-                              <w:szCs w:val="20"/>
-                            </w:rPr>
-                            <w:t>UNCLASSIFIED//FOR OFFICIAL USE ONLY</w:t>
-                          </w:r>
-                        </w:p>
-                      </w:txbxContent>
-                    </wps:txbx>
-                    <wps:bodyPr rot="0" spcFirstLastPara="0" vertOverflow="overflow" horzOverflow="overflow" vert="horz" wrap="square" lIns="91440" tIns="45720" rIns="91440" bIns="45720" numCol="1" spcCol="0" rtlCol="0" fromWordArt="0" anchor="t" anchorCtr="0" forceAA="0" compatLnSpc="1">
-                      <a:prstTxWarp prst="textNoShape">
-                        <a:avLst/>
-                      </a:prstTxWarp>
-                      <a:noAutofit/>
-                    </wps:bodyPr>
-                  </wps:wsp>
-                </a:graphicData>
-              </a:graphic>
-              <wp14:sizeRelH relativeFrom="margin">
-                <wp14:pctWidth>0</wp14:pctWidth>
-              </wp14:sizeRelH>
-              <wp14:sizeRelV relativeFrom="margin">
-                <wp14:pctHeight>0</wp14:pctHeight>
-              </wp14:sizeRelV>
-            </wp:anchor>
-          </w:drawing>
-        </mc:Choice>
-        <mc:Fallback>
-          <w:pict>
-            <v:shape w14:anchorId="399CD8D2" id="Text Box 19" o:spid="_x0000_s1027" type="#_x0000_t202" style="position:absolute;margin-left:0;margin-top:0;width:214.95pt;height:20.55pt;z-index:251658240;visibility:visible;mso-wrap-style:square;mso-width-percent:0;mso-height-percent:0;mso-wrap-distance-left:9pt;mso-wrap-distance-top:0;mso-wrap-distance-right:9pt;mso-wrap-distance-bottom:0;mso-position-horizontal:center;mso-position-horizontal-relative:margin;mso-position-vertical:bottom;mso-position-vertical-relative:top-margin-area;mso-width-percent:0;mso-height-percent:0;mso-width-relative:margin;mso-height-relative:margin;v-text-anchor:top" o:gfxdata="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" filled="f" stroked="f" strokeweight=".5pt">
-              <v:textbox>
-                <w:txbxContent>
-                  <w:p>
-                    <w:pPr>
-                      <w:jc w:val="center"/>
-                      <w:rPr>
-                        <w:rFonts w:ascii="Franklin Gothic Book" w:hAnsi="Franklin Gothic Book"/>
-                        <w:color w:val="FF0000"/>
-                        <w:sz w:val="15"/>
-                        <w:szCs w:val="15"/>
-                      </w:rPr>
-                    </w:pPr>
-                    <w:r>
-                      <w:rPr>
-                        <w:rFonts w:ascii="Franklin Gothic Medium" w:hAnsi="Franklin Gothic Medium"/>
-                        <w:color w:val="FF0000"/>
-                        <w:sz w:val="20"/>
-                        <w:szCs w:val="20"/>
-                      </w:rPr>
-                      <w:t>UNCLASSIFIED//FOR OFFICIAL USE ONLY</w:t>
-                    </w:r>
-                  </w:p>
-                </w:txbxContent>
-              </v:textbox>
-              <w10:wrap anchorx="margin" anchory="margin"/>
-              <w10:anchorlock/>
-            </v:shape>
-          </w:pict>
-        </mc:Fallback>
-      </mc:AlternateContent>
-    </w:r>
-    <w:sdt>
-      <w:sdtPr>
-        <w:id w:val="-1796517244"/>
-        <w:docPartObj>
-          <w:docPartGallery w:val="Watermarks"/>
-          <w:docPartUnique/>
-        </w:docPartObj>
-      </w:sdtPr>
-      <w:sdtContent>
-        <w:r>
-          <w:rPr>
-            <w:noProof/>
-          </w:rPr>
-          <w:pict w14:anchorId="571457AE">
-            <v:shapetype id="_x0000_t136" coordsize="21600,21600" o:spt="136" adj="10800" path="m@7,l@8,m@5,21600l@6,21600e">
-              <v:formulas>
-                <v:f eqn="sum #0 0 10800"/>
-                <v:f eqn="prod #0 2 1"/>
-                <v:f eqn="sum 21600 0 @1"/>
-                <v:f eqn="sum 0 0 @2"/>
-                <v:f eqn="sum 21600 0 @3"/>
-                <v:f eqn="if @0 @3 0"/>
-                <v:f eqn="if @0 21600 @1"/>
-                <v:f eqn="if @0 0 @2"/>
-                <v:f eqn="if @0 @4 21600"/>
-                <v:f eqn="mid @5 @6"/>
-                <v:f eqn="mid @8 @5"/>
-                <v:f eqn="mid @7 @8"/>
-                <v:f eqn="mid @6 @7"/>
-                <v:f eqn="sum @6 0 @5"/>
-              </v:formulas>
-              <v:path textpathok="t" o:connecttype="custom" o:connectlocs="@9,0;@10,10800;@11,21600;@12,10800" o:connectangles="270,180,90,0"/>
-              <v:textpath on="t" fitshape="t"/>
-              <v:handles>
-                <v:h position="#0,bottomRight" xrange="6629,14971"/>
-              </v:handles>
-              <o:lock v:ext="edit" text="t" shapetype="t"/>
-            </v:shapetype>
-            <v:shape id="PowerPlusWaterMarkObject357831064" o:spid="_x0000_s1025" type="#_x0000_t136" style="position:absolute;margin-left:0;margin-top:0;width:412.4pt;height:247.45pt;rotation:315;z-index:-251657216;mso-position-horizontal:center;mso-position-horizontal-relative:margin;mso-position-vertical:center;mso-position-vertical-relative:margin" o:allowincell="f" fillcolor="silver" stroked="f">
-              <v:fill opacity=".5"/>
-              <v:textpath style="font-family:&quot;Calibri&quot;;font-size:1pt" string="DRAFT"/>
-              <w10:wrap anchorx="margin" anchory="margin"/>
-            </v:shape>
-          </w:pict>
-        </w:r>
-      </w:sdtContent>
-    </w:sdt>
   </w:p>
 </w:hdr>
 </file>

</xml_diff>